<commit_message>
adding FIR Filter dec
timing, rtl, power
</commit_message>
<xml_diff>
--- a/ספר הפרויקט.docx
+++ b/ספר הפרויקט.docx
@@ -328,6 +328,12 @@
         </w:rPr>
         <w:t xml:space="preserve">     ת.ז: </w:t>
       </w:r>
+      <w:r>
+        <w:rPr>
+          <w:rFonts w:asciiTheme="majorBidi" w:hAnsiTheme="majorBidi" w:cstheme="majorBidi"/>
+        </w:rPr>
+        <w:t>212149686</w:t>
+      </w:r>
     </w:p>
     <w:p>
       <w:pPr>
@@ -6537,7 +6543,6 @@
         <w:ind w:left="0"/>
         <w:rPr>
           <w:rFonts w:asciiTheme="majorBidi" w:hAnsiTheme="majorBidi" w:cstheme="majorBidi"/>
-          <w:rtl/>
         </w:rPr>
       </w:pPr>
     </w:p>

</xml_diff>